<commit_message>
Projektplan: Altersabhängige Schwierigkeit nur beim Gehirn-Training
Mental-Arithmetik ist für alle Kinder gleich: gleiche Reihenfolge,
gleiches Tempo, Freischaltung ab 80 %. Einstufung nur für Denkspiele.

Co-Authored-By: Claude Opus 5.5 <noreply@anthropic.com>
Claude-Session: https://claude.ai/code/session_01P8sJrjpHzGTZMreZNqqKfd
</commit_message>
<xml_diff>
--- a/docs/projektplan.docx
+++ b/docs/projektplan.docx
@@ -125,19 +125,31 @@
         <w:pStyle w:val="FirstParagraph"/>
       </w:pPr>
       <w:r>
-        <w:t xml:space="preserve">Zorluk çocuğun yaşına göre otomatik başlar ve oynadıkça çocuğun gerçek</w:t>
-      </w:r>
-      <w:r>
-        <w:t xml:space="preserve"> </w:t>
-      </w:r>
-      <w:r>
-        <w:t xml:space="preserve">performansına göre kendiliğinden ayarlanır. Çocuğun gelişimi veli ve</w:t>
-      </w:r>
-      <w:r>
-        <w:t xml:space="preserve"> </w:t>
-      </w:r>
-      <w:r>
-        <w:t xml:space="preserve">admin panellerinde iki alan için ayrı ayrı takip edilir.</w:t>
+        <w:t xml:space="preserve">Rechnen’de her çocuk aynı müfredatı, aynı sırayla ve aynı ayarlarla</w:t>
+      </w:r>
+      <w:r>
+        <w:t xml:space="preserve"> </w:t>
+      </w:r>
+      <w:r>
+        <w:t xml:space="preserve">izler; yaşa göre zorluk yoktur. Zeka oyunlarında ise zorluk çocuğun</w:t>
+      </w:r>
+      <w:r>
+        <w:t xml:space="preserve"> </w:t>
+      </w:r>
+      <w:r>
+        <w:t xml:space="preserve">yaşına göre otomatik başlar ve oynadıkça çocuğun performansına göre</w:t>
+      </w:r>
+      <w:r>
+        <w:t xml:space="preserve"> </w:t>
+      </w:r>
+      <w:r>
+        <w:t xml:space="preserve">kendiliğinden ayarlanır. Çocuğun gelişimi veli ve admin panellerinde iki</w:t>
+      </w:r>
+      <w:r>
+        <w:t xml:space="preserve"> </w:t>
+      </w:r>
+      <w:r>
+        <w:t xml:space="preserve">alan için ayrı ayrı takip edilir.</w:t>
       </w:r>
     </w:p>
     <w:bookmarkStart w:id="20" w:name="hedef-ve-kapsam"/>
@@ -236,7 +248,7 @@
               <w:jc w:val="left"/>
             </w:pPr>
             <w:r>
-              <w:t xml:space="preserve">5–12 yaş, 4 yaş kademesi (aşağıda); okuma becerisi zayıf çocuklar için her talimat sesli de okunur</w:t>
+              <w:t xml:space="preserve">5–12 yaş (zeka oyunları için 4 yaş kademesi, aşağıda); okuma becerisi zayıf çocuklar için her talimat sesli de okunur</w:t>
             </w:r>
           </w:p>
         </w:tc>
@@ -408,7 +420,7 @@
               <w:jc w:val="left"/>
             </w:pPr>
             <w:r>
-              <w:t xml:space="preserve">Yaşa göre başlangıç + kısa seviye testi + oynadıkça otomatik ayar; veli/admin elle değiştirebilir</w:t>
+              <w:t xml:space="preserve">Rechnen: herkes için aynı, yaşa göre değişmez. Denken: yaşa göre başlangıç + kısa seviye testi + oynadıkça otomatik ayar</w:t>
             </w:r>
           </w:p>
         </w:tc>
@@ -487,13 +499,33 @@
       </w:r>
     </w:p>
     <w:bookmarkEnd w:id="20"/>
-    <w:bookmarkStart w:id="23" w:name="yaş-kademeleri-ve-otomatik-zorluk"/>
+    <w:bookmarkStart w:id="23" w:name="Xf06b1fbb70a4f24f5eaf700712826a6e46113e7"/>
     <w:p>
       <w:pPr>
         <w:pStyle w:val="Heading2"/>
       </w:pPr>
       <w:r>
-        <w:t xml:space="preserve">Yaş kademeleri ve otomatik zorluk</w:t>
+        <w:t xml:space="preserve">Yaş kademeleri ve otomatik zorluk (sadece Denken)</w:t>
+      </w:r>
+    </w:p>
+    <w:p>
+      <w:pPr>
+        <w:pStyle w:val="FirstParagraph"/>
+      </w:pPr>
+      <w:r>
+        <w:t xml:space="preserve">Bu bölüm yalnızca zeka gelişim oyunları için geçerlidir. Rechnen’de yaşa</w:t>
+      </w:r>
+      <w:r>
+        <w:t xml:space="preserve"> </w:t>
+      </w:r>
+      <w:r>
+        <w:t xml:space="preserve">göre zorluk yoktur: her çocuk Dünya 1’den başlar, sıra, Blitz hızı,</w:t>
+      </w:r>
+      <w:r>
+        <w:t xml:space="preserve"> </w:t>
+      </w:r>
+      <w:r>
+        <w:t xml:space="preserve">zincir uzunluğu ve ünite açma eşiği (%80) herkes için aynıdır.</w:t>
       </w:r>
     </w:p>
     <w:bookmarkStart w:id="21" w:name="dört-yaş-kademesi"/>
@@ -510,13 +542,19 @@
         <w:pStyle w:val="FirstParagraph"/>
       </w:pPr>
       <w:r>
-        <w:t xml:space="preserve">Her çocuk doğum yılına göre bir kademeye girer. Kademe başlangıç</w:t>
-      </w:r>
-      <w:r>
-        <w:t xml:space="preserve"> </w:t>
-      </w:r>
-      <w:r>
-        <w:t xml:space="preserve">seviyesini, ekranın görünüşünü ve hangi oyunların açık olduğunu belirler.</w:t>
+        <w:t xml:space="preserve">Her çocuk doğum yılına göre bir kademeye girer. Kademe, zeka</w:t>
+      </w:r>
+      <w:r>
+        <w:t xml:space="preserve"> </w:t>
+      </w:r>
+      <w:r>
+        <w:t xml:space="preserve">oyunlarında başlangıç seviyesini ve hangi oyunların açık olduğunu</w:t>
+      </w:r>
+      <w:r>
+        <w:t xml:space="preserve"> </w:t>
+      </w:r>
+      <w:r>
+        <w:t xml:space="preserve">belirler.</w:t>
       </w:r>
     </w:p>
     <w:tbl>
@@ -527,12 +565,10 @@
         <w:jc w:val="start"/>
       </w:tblPr>
       <w:tblGrid>
-        <w:gridCol w:w="291"/>
-        <w:gridCol w:w="255"/>
-        <w:gridCol w:w="656"/>
-        <w:gridCol w:w="2919"/>
-        <w:gridCol w:w="2189"/>
-        <w:gridCol w:w="1605"/>
+        <w:gridCol w:w="565"/>
+        <w:gridCol w:w="495"/>
+        <w:gridCol w:w="1272"/>
+        <w:gridCol w:w="5586"/>
       </w:tblGrid>
       <w:tr>
         <w:trPr>
@@ -582,31 +618,7 @@
               <w:jc w:val="left"/>
             </w:pPr>
             <w:r>
-              <w:t xml:space="preserve">Ekran ve kullanım</w:t>
-            </w:r>
-          </w:p>
-        </w:tc>
-        <w:tc>
-          <w:tcPr/>
-          <w:p>
-            <w:pPr>
-              <w:pStyle w:val="Compact"/>
-              <w:jc w:val="left"/>
-            </w:pPr>
-            <w:r>
-              <w:t xml:space="preserve">Rechnen başlangıcı</w:t>
-            </w:r>
-          </w:p>
-        </w:tc>
-        <w:tc>
-          <w:tcPr/>
-          <w:p>
-            <w:pPr>
-              <w:pStyle w:val="Compact"/>
-              <w:jc w:val="left"/>
-            </w:pPr>
-            <w:r>
-              <w:t xml:space="preserve">Denken</w:t>
+              <w:t xml:space="preserve">Zeka oyunlarında</w:t>
             </w:r>
           </w:p>
         </w:tc>
@@ -656,31 +668,7 @@
               <w:jc w:val="left"/>
             </w:pPr>
             <w:r>
-              <w:t xml:space="preserve">Çok büyük düğmeler, metin yok denecek kadar az, her şey sesli, kısa turlar (3–4 dk)</w:t>
-            </w:r>
-          </w:p>
-        </w:tc>
-        <w:tc>
-          <w:tcPr/>
-          <w:p>
-            <w:pPr>
-              <w:pStyle w:val="Compact"/>
-              <w:jc w:val="left"/>
-            </w:pPr>
-            <w:r>
-              <w:t xml:space="preserve">Dünya 1, 1–9 sayıları; Blitz 1,5 sn/sayı, 3 sayı</w:t>
-            </w:r>
-          </w:p>
-        </w:tc>
-        <w:tc>
-          <w:tcPr/>
-          <w:p>
-            <w:pPr>
-              <w:pStyle w:val="Compact"/>
-              <w:jc w:val="left"/>
-            </w:pPr>
-            <w:r>
-              <w:t xml:space="preserve">Görsel oyunlar; okuma gerektiren oyun yok</w:t>
+              <w:t xml:space="preserve">8 görsel oyun, okuma gerekmez; kısa turlar (1–2 dk); başlangıç seviyesi 1–3</w:t>
             </w:r>
           </w:p>
         </w:tc>
@@ -730,31 +718,7 @@
               <w:jc w:val="left"/>
             </w:pPr>
             <w:r>
-              <w:t xml:space="preserve">Büyük düğmeler, kısa cümleler, sesli okuma açık</w:t>
-            </w:r>
-          </w:p>
-        </w:tc>
-        <w:tc>
-          <w:tcPr/>
-          <w:p>
-            <w:pPr>
-              <w:pStyle w:val="Compact"/>
-              <w:jc w:val="left"/>
-            </w:pPr>
-            <w:r>
-              <w:t xml:space="preserve">Dünya 1–2; Blitz 1,2 sn/sayı, 4–5 sayı</w:t>
-            </w:r>
-          </w:p>
-        </w:tc>
-        <w:tc>
-          <w:tcPr/>
-          <w:p>
-            <w:pPr>
-              <w:pStyle w:val="Compact"/>
-              <w:jc w:val="left"/>
-            </w:pPr>
-            <w:r>
-              <w:t xml:space="preserve">Tüm alanlar, temel seviyeler</w:t>
+              <w:t xml:space="preserve">15 oyun, temel seviyeler; başlangıç seviyesi 3–6</w:t>
             </w:r>
           </w:p>
         </w:tc>
@@ -804,31 +768,7 @@
               <w:jc w:val="left"/>
             </w:pPr>
             <w:r>
-              <w:t xml:space="preserve">Normal düzen, sesli okuma isteğe bağlı</w:t>
-            </w:r>
-          </w:p>
-        </w:tc>
-        <w:tc>
-          <w:tcPr/>
-          <w:p>
-            <w:pPr>
-              <w:pStyle w:val="Compact"/>
-              <w:jc w:val="left"/>
-            </w:pPr>
-            <w:r>
-              <w:t xml:space="preserve">Seviye testine göre Dünya 2–4; Blitz 0,9 sn/sayı, 5–7 sayı</w:t>
-            </w:r>
-          </w:p>
-        </w:tc>
-        <w:tc>
-          <w:tcPr/>
-          <w:p>
-            <w:pPr>
-              <w:pStyle w:val="Compact"/>
-              <w:jc w:val="left"/>
-            </w:pPr>
-            <w:r>
-              <w:t xml:space="preserve">Tüm alanlar, orta seviyeler</w:t>
+              <w:t xml:space="preserve">18 oyunun hepsi, orta seviyeler; başlangıç seviyesi 6–10</w:t>
             </w:r>
           </w:p>
         </w:tc>
@@ -878,31 +818,7 @@
               <w:jc w:val="left"/>
             </w:pPr>
             <w:r>
-              <w:t xml:space="preserve">Daha sade, daha az çocuksu görünüm; süre ve rekor öne çıkar</w:t>
-            </w:r>
-          </w:p>
-        </w:tc>
-        <w:tc>
-          <w:tcPr/>
-          <w:p>
-            <w:pPr>
-              <w:pStyle w:val="Compact"/>
-              <w:jc w:val="left"/>
-            </w:pPr>
-            <w:r>
-              <w:t xml:space="preserve">Seviye testine göre Dünya 3–6; Blitz 0,7 sn/sayı, 6–8 sayı</w:t>
-            </w:r>
-          </w:p>
-        </w:tc>
-        <w:tc>
-          <w:tcPr/>
-          <w:p>
-            <w:pPr>
-              <w:pStyle w:val="Compact"/>
-              <w:jc w:val="left"/>
-            </w:pPr>
-            <w:r>
-              <w:t xml:space="preserve">Tüm alanlar, ileri seviyeler, süre modu</w:t>
+              <w:t xml:space="preserve">18 oyunun hepsi, ileri seviyeler ve süre modu; başlangıç seviyesi 9–13</w:t>
             </w:r>
           </w:p>
         </w:tc>
@@ -925,13 +841,7 @@
         <w:t xml:space="preserve"> </w:t>
       </w:r>
       <w:r>
-        <w:t xml:space="preserve">bir çocuk daha kolay seviyelerden çalışabilir. Görünüm (düğme boyutu,</w:t>
-      </w:r>
-      <w:r>
-        <w:t xml:space="preserve"> </w:t>
-      </w:r>
-      <w:r>
-        <w:t xml:space="preserve">sesli okuma) yaşa bağlı kalır, içerik performansa göre kayar.</w:t>
+        <w:t xml:space="preserve">bir çocuk daha kolay seviyelerden çalışabilir.</w:t>
       </w:r>
     </w:p>
     <w:bookmarkEnd w:id="21"/>
@@ -1007,25 +917,25 @@
         <w:t xml:space="preserve"> </w:t>
       </w:r>
       <w:r>
-        <w:t xml:space="preserve">İlk girişte 5 dakikalık oyun gibi bir</w:t>
-      </w:r>
-      <w:r>
-        <w:t xml:space="preserve"> </w:t>
-      </w:r>
-      <w:r>
-        <w:t xml:space="preserve">test: 3 kısa zeka oyunu ve 10 abaküs sorusu. Sonuç başlangıç</w:t>
-      </w:r>
-      <w:r>
-        <w:t xml:space="preserve"> </w:t>
-      </w:r>
-      <w:r>
-        <w:t xml:space="preserve">seviyesini kademe içinde yukarı veya aşağı kaydırır. Çocuk bunu test</w:t>
-      </w:r>
-      <w:r>
-        <w:t xml:space="preserve"> </w:t>
-      </w:r>
-      <w:r>
-        <w:t xml:space="preserve">olarak değil,</w:t>
+        <w:t xml:space="preserve">İlk girişte 3–4 dakikalık oyun gibi</w:t>
+      </w:r>
+      <w:r>
+        <w:t xml:space="preserve"> </w:t>
+      </w:r>
+      <w:r>
+        <w:t xml:space="preserve">bir test: 3 kısa zeka oyunu (Gedächtnis, Logik, Konzentration).</w:t>
+      </w:r>
+      <w:r>
+        <w:t xml:space="preserve"> </w:t>
+      </w:r>
+      <w:r>
+        <w:t xml:space="preserve">Sonuç zeka oyunlarının başlangıç seviyesini kademe içinde yukarı veya</w:t>
+      </w:r>
+      <w:r>
+        <w:t xml:space="preserve"> </w:t>
+      </w:r>
+      <w:r>
+        <w:t xml:space="preserve">aşağı kaydırır. Çocuk bunu test olarak değil,</w:t>
       </w:r>
       <w:r>
         <w:t xml:space="preserve"> </w:t>
@@ -1043,7 +953,7 @@
         <w:t xml:space="preserve"> </w:t>
       </w:r>
       <w:r>
-        <w:t xml:space="preserve">olarak görür.</w:t>
+        <w:t xml:space="preserve">olarak görür. Rechnen için seviye testi yoktur.</w:t>
       </w:r>
     </w:p>
     <w:p>
@@ -1157,31 +1067,19 @@
           <w:bCs/>
           <w:b/>
         </w:rPr>
-        <w:t xml:space="preserve">Rechnen’de ayar:</w:t>
-      </w:r>
-      <w:r>
-        <w:t xml:space="preserve"> </w:t>
-      </w:r>
-      <w:r>
-        <w:t xml:space="preserve">Ünite sırası değişmez (kurallar birbirine</w:t>
-      </w:r>
-      <w:r>
-        <w:t xml:space="preserve"> </w:t>
-      </w:r>
-      <w:r>
-        <w:t xml:space="preserve">dayanır), ama yaşa ve performansa göre değişenler: Blitz hızı, zincir</w:t>
-      </w:r>
-      <w:r>
-        <w:t xml:space="preserve"> </w:t>
-      </w:r>
-      <w:r>
-        <w:t xml:space="preserve">uzunluğu, soru başına süre, ipucu sıklığı, bir sonraki üniteyi açma</w:t>
-      </w:r>
-      <w:r>
-        <w:t xml:space="preserve"> </w:t>
-      </w:r>
-      <w:r>
-        <w:t xml:space="preserve">eşiği (A kademesinde %70, diğerlerinde %80).</w:t>
+        <w:t xml:space="preserve">Elle değiştirme:</w:t>
+      </w:r>
+      <w:r>
+        <w:t xml:space="preserve"> </w:t>
+      </w:r>
+      <w:r>
+        <w:t xml:space="preserve">Veli ve admin bir zeka oyununun seviyesini</w:t>
+      </w:r>
+      <w:r>
+        <w:t xml:space="preserve"> </w:t>
+      </w:r>
+      <w:r>
+        <w:t xml:space="preserve">kilitleyebilir veya değiştirebilir.</w:t>
       </w:r>
     </w:p>
     <w:p>
@@ -1197,19 +1095,19 @@
           <w:bCs/>
           <w:b/>
         </w:rPr>
-        <w:t xml:space="preserve">Elle değiştirme:</w:t>
-      </w:r>
-      <w:r>
-        <w:t xml:space="preserve"> </w:t>
-      </w:r>
-      <w:r>
-        <w:t xml:space="preserve">Veli ve admin bir oyunun veya Rechnen’in</w:t>
-      </w:r>
-      <w:r>
-        <w:t xml:space="preserve"> </w:t>
-      </w:r>
-      <w:r>
-        <w:t xml:space="preserve">seviyesini kilitleyebilir veya değiştirebilir (ör. eğitmen</w:t>
+        <w:t xml:space="preserve">Yaş günü:</w:t>
+      </w:r>
+      <w:r>
+        <w:t xml:space="preserve"> </w:t>
+      </w:r>
+      <w:r>
+        <w:t xml:space="preserve">Çocuk bir yaş büyüdüğünde kademe otomatik değişir,</w:t>
+      </w:r>
+      <w:r>
+        <w:t xml:space="preserve"> </w:t>
+      </w:r>
+      <w:r>
+        <w:t xml:space="preserve">ilerleme korunur; yeni kademede açılan oyunlar bir</w:t>
       </w:r>
       <w:r>
         <w:t xml:space="preserve"> </w:t>
@@ -1218,79 +1116,65 @@
         <w:t xml:space="preserve">“</w:t>
       </w:r>
       <w:r>
-        <w:t xml:space="preserve">bu hafta</w:t>
-      </w:r>
-      <w:r>
-        <w:t xml:space="preserve"> </w:t>
-      </w:r>
-      <w:r>
-        <w:t xml:space="preserve">sadece +7 çalışsın</w:t>
+        <w:t xml:space="preserve">Überraschung</w:t>
       </w:r>
       <w:r>
         <w:t xml:space="preserve">”</w:t>
       </w:r>
       <w:r>
-        <w:t xml:space="preserve">).</w:t>
+        <w:t xml:space="preserve"> </w:t>
+      </w:r>
+      <w:r>
+        <w:t xml:space="preserve">olarak gösterilir.</w:t>
       </w:r>
     </w:p>
     <w:p>
       <w:pPr>
-        <w:numPr>
-          <w:ilvl w:val="0"/>
-          <w:numId w:val="1002"/>
-        </w:numPr>
-        <w:pStyle w:val="Compact"/>
-      </w:pPr>
-      <w:r>
-        <w:rPr>
-          <w:bCs/>
-          <w:b/>
-        </w:rPr>
-        <w:t xml:space="preserve">Yaş günü:</w:t>
-      </w:r>
-      <w:r>
-        <w:t xml:space="preserve"> </w:t>
-      </w:r>
-      <w:r>
-        <w:t xml:space="preserve">Çocuk bir yaş büyüdüğünde kademe otomatik değişir,</w:t>
-      </w:r>
-      <w:r>
-        <w:t xml:space="preserve"> </w:t>
-      </w:r>
-      <w:r>
-        <w:t xml:space="preserve">ilerleme korunur; yeni kademede açılan oyunlar bir</w:t>
-      </w:r>
-      <w:r>
-        <w:t xml:space="preserve"> </w:t>
-      </w:r>
-      <w:r>
-        <w:t xml:space="preserve">“</w:t>
-      </w:r>
-      <w:r>
-        <w:t xml:space="preserve">Überraschung</w:t>
-      </w:r>
-      <w:r>
-        <w:t xml:space="preserve">”</w:t>
-      </w:r>
-      <w:r>
-        <w:t xml:space="preserve"> </w:t>
-      </w:r>
-      <w:r>
-        <w:t xml:space="preserve">olarak gösterilir.</w:t>
+        <w:pStyle w:val="FirstParagraph"/>
+      </w:pPr>
+      <w:r>
+        <w:t xml:space="preserve">Tüm bu hesaplama uygulamanın içinde, çevrimdışı da çalışır; sonuçlar</w:t>
+      </w:r>
+      <w:r>
+        <w:t xml:space="preserve"> </w:t>
+      </w:r>
+      <w:r>
+        <w:t xml:space="preserve">internet gelince sunucuya gönderilir.</w:t>
       </w:r>
     </w:p>
     <w:p>
       <w:pPr>
-        <w:pStyle w:val="FirstParagraph"/>
-      </w:pPr>
-      <w:r>
-        <w:t xml:space="preserve">Tüm bu hesaplama uygulamanın içinde, çevrimdışı da çalışır; sonuçlar</w:t>
-      </w:r>
-      <w:r>
-        <w:t xml:space="preserve"> </w:t>
-      </w:r>
-      <w:r>
-        <w:t xml:space="preserve">internet gelince sunucuya gönderilir.</w:t>
+        <w:pStyle w:val="BodyText"/>
+      </w:pPr>
+      <w:r>
+        <w:t xml:space="preserve">Rechnen’de eğitmenin elindeki tek ayar, bir sınıf veya çocuk için</w:t>
+      </w:r>
+      <w:r>
+        <w:t xml:space="preserve"> </w:t>
+      </w:r>
+      <w:r>
+        <w:t xml:space="preserve">üniteleri açmak ve kilitlemektir (ör.</w:t>
+      </w:r>
+      <w:r>
+        <w:t xml:space="preserve"> </w:t>
+      </w:r>
+      <w:r>
+        <w:t xml:space="preserve">“</w:t>
+      </w:r>
+      <w:r>
+        <w:t xml:space="preserve">bu hafta sadece +7 çalışsın</w:t>
+      </w:r>
+      <w:r>
+        <w:t xml:space="preserve">”</w:t>
+      </w:r>
+      <w:r>
+        <w:t xml:space="preserve">).</w:t>
+      </w:r>
+      <w:r>
+        <w:t xml:space="preserve"> </w:t>
+      </w:r>
+      <w:r>
+        <w:t xml:space="preserve">Bu, yaşa göre değil eğitmenin kararıyla yapılır.</w:t>
       </w:r>
     </w:p>
     <w:bookmarkEnd w:id="22"/>
@@ -2832,7 +2716,7 @@
         <w:pStyle w:val="FirstParagraph"/>
       </w:pPr>
       <w:r>
-        <w:t xml:space="preserve">Çocuk Weltkarte’yi açtığında ona göre hazırlanmış bir</w:t>
+        <w:t xml:space="preserve">Çocuk Weltkarte’yi açtığında bir</w:t>
       </w:r>
       <w:r>
         <w:t xml:space="preserve"> </w:t>
@@ -2848,7 +2732,7 @@
         <w:t xml:space="preserve"> </w:t>
       </w:r>
       <w:r>
-        <w:t xml:space="preserve">görür (A kademesinde ~10 dk, D kademesinde ~20 dk):</w:t>
+        <w:t xml:space="preserve">görür (~15–20 dk):</w:t>
       </w:r>
     </w:p>
     <w:p>
@@ -2886,13 +2770,13 @@
           <w:bCs/>
           <w:b/>
         </w:rPr>
-        <w:t xml:space="preserve">Rechnen (5–12 dk):</w:t>
-      </w:r>
-      <w:r>
-        <w:t xml:space="preserve"> </w:t>
-      </w:r>
-      <w:r>
-        <w:t xml:space="preserve">Sıradaki ünitenin istasyonu.</w:t>
+        <w:t xml:space="preserve">Rechnen (10–12 dk):</w:t>
+      </w:r>
+      <w:r>
+        <w:t xml:space="preserve"> </w:t>
+      </w:r>
+      <w:r>
+        <w:t xml:space="preserve">Sıradaki ünitenin istasyonu; herkes için aynı.</w:t>
       </w:r>
     </w:p>
     <w:p>
@@ -3159,7 +3043,7 @@
               <w:jc w:val="left"/>
             </w:pPr>
             <w:r>
-              <w:t xml:space="preserve">Öğrenci, sınıf ve veli hesabı açar (doğum yılıyla); sınıflara ünite ve oyun açar/kilitler; seviyeleri elle değiştirir; tüm çocukların ilerlemesini, hata analizini ve zeka profilini görür; mağaza, rozet ve etkinlikleri yönetir; soru setlerini düzenler</w:t>
+              <w:t xml:space="preserve">Öğrenci, sınıf ve veli hesabı açar (doğum yılıyla); sınıflara ünite ve oyun açar/kilitler; zeka oyunlarının seviyesini elle değiştirir; tüm çocukların ilerlemesini, hata analizini ve zeka profilini görür; mağaza, rozet ve etkinlikleri yönetir; soru setlerini düzenler</w:t>
             </w:r>
           </w:p>
         </w:tc>
@@ -3306,13 +3190,13 @@
         <w:t xml:space="preserve"> </w:t>
       </w:r>
       <w:r>
-        <w:t xml:space="preserve">kullandığı sırayla birebir aynı. Yaşa göre değişen şey sıra değil,</w:t>
-      </w:r>
-      <w:r>
-        <w:t xml:space="preserve"> </w:t>
-      </w:r>
-      <w:r>
-        <w:t xml:space="preserve">hız ve zincir uzunluğudur (yukarıdaki tablo).</w:t>
+        <w:t xml:space="preserve">kullandığı sırayla birebir aynı. Yaşa göre zorluk yoktur: her çocuk</w:t>
+      </w:r>
+      <w:r>
+        <w:t xml:space="preserve"> </w:t>
+      </w:r>
+      <w:r>
+        <w:t xml:space="preserve">Dünya 1’den başlar ve aynı sorularla, aynı ayarlarla ilerler.</w:t>
       </w:r>
     </w:p>
     <w:tbl>
@@ -3987,25 +3871,19 @@
         <w:pStyle w:val="FirstParagraph"/>
       </w:pPr>
       <w:r>
-        <w:t xml:space="preserve">Her ünite 6 istasyondan oluşur ve 10–15 dakikada biter (A kademesinde</w:t>
-      </w:r>
-      <w:r>
-        <w:t xml:space="preserve"> </w:t>
-      </w:r>
-      <w:r>
-        <w:t xml:space="preserve">istasyonlar ikiye bölünür, her biri ~5 dk). İstasyonlar sırayla açılır;</w:t>
-      </w:r>
-      <w:r>
-        <w:t xml:space="preserve"> </w:t>
-      </w:r>
-      <w:r>
-        <w:t xml:space="preserve">bir istasyon 1–3 yıldızla tamamlanır, bir sonraki ünite yaş kademesine</w:t>
-      </w:r>
-      <w:r>
-        <w:t xml:space="preserve"> </w:t>
-      </w:r>
-      <w:r>
-        <w:t xml:space="preserve">göre %70 veya %80 doğrulukla açılır.</w:t>
+        <w:t xml:space="preserve">Her ünite 6 istasyondan oluşur ve 10–15 dakikada biter. İstasyonlar</w:t>
+      </w:r>
+      <w:r>
+        <w:t xml:space="preserve"> </w:t>
+      </w:r>
+      <w:r>
+        <w:t xml:space="preserve">sırayla açılır; bir istasyon 1–3 yıldızla tamamlanır, bir sonraki ünite</w:t>
+      </w:r>
+      <w:r>
+        <w:t xml:space="preserve"> </w:t>
+      </w:r>
+      <w:r>
+        <w:t xml:space="preserve">en az %80 doğrulukla açılır.</w:t>
       </w:r>
     </w:p>
     <w:p>
@@ -4141,7 +4019,7 @@
         <w:t xml:space="preserve"> </w:t>
       </w:r>
       <w:r>
-        <w:t xml:space="preserve">yanıp söner, hız yaşa ve performansa göre otomatik ayarlanır, 15 soru.</w:t>
+        <w:t xml:space="preserve">yanıp söner, hız MathKids’teki aşamanın hızıdır, süreye karşı 15 soru.</w:t>
       </w:r>
     </w:p>
     <w:p>
@@ -5714,7 +5592,7 @@
               <w:t xml:space="preserve">”</w:t>
             </w:r>
             <w:r>
-              <w:t xml:space="preserve">: 3 zeka oyunu + 10 abaküs sorusu</w:t>
+              <w:t xml:space="preserve">: zeka oyunları için 3 kısa oyun</w:t>
             </w:r>
           </w:p>
         </w:tc>
@@ -6864,7 +6742,7 @@
               <w:jc w:val="left"/>
             </w:pPr>
             <w:r>
-              <w:t xml:space="preserve">Tek çocuğun tüm verisi, Gehirn-Profil, seviyeyi elle değiştirme, not</w:t>
+              <w:t xml:space="preserve">Tek çocuğun tüm verisi, Gehirn-Profil, oyun seviyesini elle değiştirme, not</w:t>
             </w:r>
           </w:p>
         </w:tc>
@@ -7255,7 +7133,7 @@
               <w:jc w:val="left"/>
             </w:pPr>
             <w:r>
-              <w:t xml:space="preserve">Zorluk motoru</w:t>
+              <w:t xml:space="preserve">Zorluk motoru (Denken)</w:t>
             </w:r>
           </w:p>
         </w:tc>
@@ -7632,19 +7510,19 @@
               <w:jc w:val="left"/>
             </w:pPr>
             <w:r>
-              <w:t xml:space="preserve">PWA iskeleti, abaküs bileşeni, Start; öğrenci girişi; yaş kademesi ve zorluk motoru; Dünya 1’in ilk ünitesi (6 istasyon); ilk 3 zeka oyunu (Perlen-Memory, Muster-Meister, Perlen-Kette)</w:t>
-            </w:r>
-          </w:p>
-        </w:tc>
-        <w:tc>
-          <w:tcPr/>
-          <w:p>
-            <w:pPr>
-              <w:pStyle w:val="Compact"/>
-              <w:jc w:val="left"/>
-            </w:pPr>
-            <w:r>
-              <w:t xml:space="preserve">5 ve 10 yaşında birer çocuk üniteyi ve 3 oyunu tabletinde yardımsız bitirir; zorluk ikisine farklı ayarlanır</w:t>
+              <w:t xml:space="preserve">PWA iskeleti, abaküs bileşeni, Start; öğrenci girişi; Dünya 1’in ilk ünitesi (6 istasyon); yaş kademesi ve zorluk motoru; ilk 3 zeka oyunu (Perlen-Memory, Muster-Meister, Perlen-Kette)</w:t>
+            </w:r>
+          </w:p>
+        </w:tc>
+        <w:tc>
+          <w:tcPr/>
+          <w:p>
+            <w:pPr>
+              <w:pStyle w:val="Compact"/>
+              <w:jc w:val="left"/>
+            </w:pPr>
+            <w:r>
+              <w:t xml:space="preserve">5 ve 10 yaşında birer çocuk üniteyi ve 3 oyunu tabletinde yardımsız bitirir; zeka oyunlarında zorluk ikisine farklı ayarlanır</w:t>
             </w:r>
           </w:p>
         </w:tc>
@@ -7682,7 +7560,7 @@
               <w:jc w:val="left"/>
             </w:pPr>
             <w:r>
-              <w:t xml:space="preserve">29 ünitenin hepsi, 1.930 soru, videolar, yaşa göre hız ve zincir ayarı</w:t>
+              <w:t xml:space="preserve">29 ünitenin hepsi, 1.930 soru, videolar</w:t>
             </w:r>
           </w:p>
         </w:tc>
@@ -7894,7 +7772,7 @@
               <w:jc w:val="left"/>
             </w:pPr>
             <w:r>
-              <w:t xml:space="preserve">Çocuk ve veli geri bildirimi; zorluk ayarı iki grupta da doğru; hata listesi temizlenir</w:t>
+              <w:t xml:space="preserve">Çocuk ve veli geri bildirimi; zeka oyunlarında zorluk ayarı iki grupta da doğru; hata listesi temizlenir</w:t>
             </w:r>
           </w:p>
         </w:tc>
@@ -8060,7 +7938,7 @@
         <w:t xml:space="preserve"> </w:t>
       </w:r>
       <w:r>
-        <w:t xml:space="preserve">zeka gelişimi, yaşa göre otomatik zorluk.</w:t>
+        <w:t xml:space="preserve">zeka gelişimi.</w:t>
       </w:r>
     </w:p>
     <w:p>
@@ -8072,7 +7950,20 @@
         <w:pStyle w:val="Compact"/>
       </w:pPr>
       <w:r>
-        <w:t xml:space="preserve">☐ Zeka oyunları: 18 oyunluk liste uygun mu, eklemek veya çıkarmak istediğin oyun var mı?</w:t>
+        <w:t xml:space="preserve">☒ Yaşa göre otomatik zorluk</w:t>
+      </w:r>
+      <w:r>
+        <w:t xml:space="preserve"> </w:t>
+      </w:r>
+      <w:r>
+        <w:rPr>
+          <w:bCs/>
+          <w:b/>
+        </w:rPr>
+        <w:t xml:space="preserve">sadece zeka oyunlarında</w:t>
+      </w:r>
+      <w:r>
+        <w:t xml:space="preserve">; Rechnen herkes için aynı.</w:t>
       </w:r>
     </w:p>
     <w:p>
@@ -8084,7 +7975,7 @@
         <w:pStyle w:val="Compact"/>
       </w:pPr>
       <w:r>
-        <w:t xml:space="preserve">☐ Günlük plan: Rechnen ve Denken süresinin oranı (öneri: ~%60 Rechnen, ~%40 Denken) uygun mu?</w:t>
+        <w:t xml:space="preserve">☐ Zeka oyunları: 18 oyunluk liste uygun mu, eklemek veya çıkarmak istediğin oyun var mı?</w:t>
       </w:r>
     </w:p>
     <w:p>
@@ -8096,7 +7987,19 @@
         <w:pStyle w:val="Compact"/>
       </w:pPr>
       <w:r>
-        <w:t xml:space="preserve">☐ Seviye testi (Einstufung) ilk girişte zorunlu mu olsun, yoksa atlanabilir mi?</w:t>
+        <w:t xml:space="preserve">☐ Günlük plan: Rechnen ve Denken süresinin oranı (öneri: ~%60 Rechnen, ~%40 Denken) uygun mu?</w:t>
+      </w:r>
+    </w:p>
+    <w:p>
+      <w:pPr>
+        <w:numPr>
+          <w:ilvl w:val="0"/>
+          <w:numId w:val="1006"/>
+        </w:numPr>
+        <w:pStyle w:val="Compact"/>
+      </w:pPr>
+      <w:r>
+        <w:t xml:space="preserve">☐ Zeka oyunları için seviye testi (Einstufung) ilk girişte zorunlu mu olsun, yoksa atlanabilir mi?</w:t>
       </w:r>
     </w:p>
     <w:p>

</xml_diff>

<commit_message>
Startseite: lebendiges Logo BrainFit Kids mit Untertitel Mental Arithmetik
- Name einheitlich BrainFit Kids
- Titeltext hat eine feste Farbe (war in der Vorschau schwarz)

Co-Authored-By: Claude Opus 5.5 <noreply@anthropic.com>
Claude-Session: https://claude.ai/code/session_01P8sJrjpHzGTZMreZNqqKfd
</commit_message>
<xml_diff>
--- a/docs/projektplan.docx
+++ b/docs/projektplan.docx
@@ -2,13 +2,13 @@
 <file path=word/document.xml><?xml version="1.0" encoding="utf-8"?>
 <w:document xmlns:w="http://schemas.openxmlformats.org/wordprocessingml/2006/main" xmlns:m="http://schemas.openxmlformats.org/officeDocument/2006/math" xmlns:r="http://schemas.openxmlformats.org/officeDocument/2006/relationships" xmlns:o="urn:schemas-microsoft-com:office:office" xmlns:v="urn:schemas-microsoft-com:vml" xmlns:w10="urn:schemas-microsoft-com:office:word" xmlns:a="http://schemas.openxmlformats.org/drawingml/2006/main" xmlns:pic="http://schemas.openxmlformats.org/drawingml/2006/picture" xmlns:wp="http://schemas.openxmlformats.org/drawingml/2006/wordprocessingDrawing">
   <w:body>
-    <w:bookmarkStart w:id="38" w:name="brain-fit-kids-projektplan"/>
+    <w:bookmarkStart w:id="38" w:name="brainfit-kids-projektplan"/>
     <w:p>
       <w:pPr>
         <w:pStyle w:val="Heading1"/>
       </w:pPr>
       <w:r>
-        <w:t xml:space="preserve">Brain Fit Kids – Projektplan</w:t>
+        <w:t xml:space="preserve">BrainFit Kids – Projektplan</w:t>
       </w:r>
     </w:p>
     <w:p>
@@ -34,7 +34,7 @@
           <w:bCs/>
           <w:b/>
         </w:rPr>
-        <w:t xml:space="preserve">Brain Fit Kids – Mental Arithmetik</w:t>
+        <w:t xml:space="preserve">BrainFit Kids – Mental Arithmetik</w:t>
       </w:r>
       <w:r>
         <w:t xml:space="preserve">, 5–12 yaş arası çocuklar için</w:t>
@@ -5333,7 +5333,7 @@
         <w:t xml:space="preserve">“</w:t>
       </w:r>
       <w:r>
-        <w:t xml:space="preserve">Brain Fit Kids – UI Design</w:t>
+        <w:t xml:space="preserve">BrainFit Kids – UI Design</w:t>
       </w:r>
       <w:r>
         <w:t xml:space="preserve">”</w:t>
@@ -7869,7 +7869,7 @@
           <w:bCs/>
           <w:b/>
         </w:rPr>
-        <w:t xml:space="preserve">Brain Fit Kids</w:t>
+        <w:t xml:space="preserve">BrainFit Kids</w:t>
       </w:r>
       <w:r>
         <w:t xml:space="preserve">, alt başlık</w:t>

</xml_diff>

<commit_message>
Einstufung „Perli kennenlernen“ und Denkspiel Perlen-Jagd
- Einstufung: 3 kurze Spiele (Gedächtnis, Logik, Konzentration),
  verschiebt die Startstufe je Bereich um −1 bis +2; überspringbar
- Aufwärmen im Tagesplan führt zuerst zur Einstufung
- Perlen-Jagd: Zielperlen finden, 20 Stufen (größeres Raster,
  ähnliche Farben, zwei Zielfarben)
- Spiele können kürzere Runden spielen

Co-Authored-By: Claude Opus 5.5 <noreply@anthropic.com>
Claude-Session: https://claude.ai/code/session_01P8sJrjpHzGTZMreZNqqKfd
</commit_message>
<xml_diff>
--- a/docs/projektplan.docx
+++ b/docs/projektplan.docx
@@ -7534,7 +7534,7 @@
               <w:jc w:val="left"/>
             </w:pPr>
             <w:r>
-              <w:t xml:space="preserve">Kodlandı, test bekliyor: Start, Anmelden, Weltkarte, Dünya 1 Ünite 1 (6 istasyon), zorluk motoru, Denk-Park, 3 oyun. Eksik: Einstufung, gerçek sorular ve videolar, Supabase</w:t>
+              <w:t xml:space="preserve">Kodlandı, test bekliyor: Start, Anmelden, Weltkarte, Dünya 1 Ünite 1 (6 istasyon), zorluk motoru, Einstufung, Denk-Park, 4 oyun (Memory, Kette, Muster, Jagd). Eksik: gerçek sorular ve videolar, Supabase</w:t>
             </w:r>
           </w:p>
         </w:tc>
@@ -7999,7 +7999,35 @@
         <w:pStyle w:val="Compact"/>
       </w:pPr>
       <w:r>
-        <w:t xml:space="preserve">☐ Zeka oyunları için seviye testi (Einstufung) ilk girişte zorunlu mu olsun, yoksa atlanabilir mi?</w:t>
+        <w:t xml:space="preserve">☐ Zeka oyunları için seviye testi (Einstufung): şimdilik</w:t>
+      </w:r>
+      <w:r>
+        <w:t xml:space="preserve"> </w:t>
+      </w:r>
+      <w:r>
+        <w:rPr>
+          <w:bCs/>
+          <w:b/>
+        </w:rPr>
+        <w:t xml:space="preserve">atlanabilir</w:t>
+      </w:r>
+      <w:r>
+        <w:t xml:space="preserve"> </w:t>
+      </w:r>
+      <w:r>
+        <w:t xml:space="preserve">(</w:t>
+      </w:r>
+      <w:r>
+        <w:t xml:space="preserve">“</w:t>
+      </w:r>
+      <w:r>
+        <w:t xml:space="preserve">Später</w:t>
+      </w:r>
+      <w:r>
+        <w:t xml:space="preserve">”</w:t>
+      </w:r>
+      <w:r>
+        <w:t xml:space="preserve">); atlanırsa yaş kademesinin başlangıç seviyesi kullanılır. Zorunlu olsun mu?</w:t>
       </w:r>
     </w:p>
     <w:p>

</xml_diff>

<commit_message>
Lernvideos und MathKids-Fragen aus dem MathKids-Spiel übernommen
- content/videos.json: 48 Videolinks (je Level der Knopf „Watch Video“)
- content/mathkids-levels.json: 96 Level, 1.440 Fragen; 33 falsche
  Antworten nach der Summe korrigiert und aufgelistet
- Videos den 23 Einheiten zugeordnet (−4 fehlt: in MathKids gleiches
  Video wie −6)
- Video-Station: mehrere Videos je Einheit, YouTube-Player meldet das
  Ende, „Weiter“ erst danach; Knopf „Auf YouTube ansehen“

Co-Authored-By: Claude Opus 5.5 <noreply@anthropic.com>
Claude-Session: https://claude.ai/code/session_01P8sJrjpHzGTZMreZNqqKfd
</commit_message>
<xml_diff>
--- a/docs/projektplan.docx
+++ b/docs/projektplan.docx
@@ -3857,6 +3857,53 @@
         <w:t xml:space="preserve">gidiyor; bu düzeltilmeli.</w:t>
       </w:r>
     </w:p>
+    <w:p>
+      <w:pPr>
+        <w:pStyle w:val="BodyText"/>
+      </w:pPr>
+      <w:r>
+        <w:t xml:space="preserve">Video linkleri ve MathKids’in 96 seviyesi (1.440 soru, 33 cevabı düzeltilmiş) MathKids oyunundan çıkarıldı:</w:t>
+      </w:r>
+      <w:r>
+        <w:t xml:space="preserve"> </w:t>
+      </w:r>
+      <w:r>
+        <w:rPr>
+          <w:rStyle w:val="VerbatimChar"/>
+        </w:rPr>
+        <w:t xml:space="preserve">content/videos.json</w:t>
+      </w:r>
+      <w:r>
+        <w:t xml:space="preserve">,</w:t>
+      </w:r>
+      <w:r>
+        <w:t xml:space="preserve"> </w:t>
+      </w:r>
+      <w:r>
+        <w:rPr>
+          <w:rStyle w:val="VerbatimChar"/>
+        </w:rPr>
+        <w:t xml:space="preserve">content/mathkids-levels.json</w:t>
+      </w:r>
+      <w:r>
+        <w:t xml:space="preserve">. Düzeltilen sorular dosyada</w:t>
+      </w:r>
+      <w:r>
+        <w:t xml:space="preserve"> </w:t>
+      </w:r>
+      <w:r>
+        <w:rPr>
+          <w:rStyle w:val="VerbatimChar"/>
+        </w:rPr>
+        <w:t xml:space="preserve">korrigiert</w:t>
+      </w:r>
+      <w:r>
+        <w:t xml:space="preserve"> </w:t>
+      </w:r>
+      <w:r>
+        <w:t xml:space="preserve">altında listeli.</w:t>
+      </w:r>
+    </w:p>
     <w:bookmarkStart w:id="30" w:name="bir-ünitenin-akışı"/>
     <w:p>
       <w:pPr>
@@ -7534,7 +7581,7 @@
               <w:jc w:val="left"/>
             </w:pPr>
             <w:r>
-              <w:t xml:space="preserve">Kodlandı, test bekliyor: Start, Anmelden, Weltkarte, Dünya 1 Ünite 1 (6 istasyon), zorluk motoru, Einstufung, Denk-Park, 4 oyun (Memory, Kette, Muster, Jagd). Eksik: gerçek sorular ve videolar, Supabase</w:t>
+              <w:t xml:space="preserve">Kodlandı, test bekliyor: Start, Anmelden, Weltkarte, Dünya 1 Ünite 1 (6 istasyon), zorluk motoru, Einstufung, Denk-Park, 4 oyun (Memory, Kette, Muster, Jagd). 47 video ünitelere bağlandı. Eksik: Abakuskids soruları, Supabase</w:t>
             </w:r>
           </w:p>
         </w:tc>

</xml_diff>

<commit_message>
Videos aus dem Drive-Ordner: Lektion 2, 3 und Big Friends −4
- content/videos.json um die 50 Drive-Videos ergänzt
- Einheit 1-2: 2. Lektion, 1-3: 3. Lektion, 5-3: richtiges −4-Video
- Drive-Videos im eingebetteten Drive-Player (direkte MP4-Links
  blockiert der Browser); „Weiter“ nach 90 % der Laufzeit, gezählt
  nur bei sichtbarer Seite

Co-Authored-By: Claude Opus 5.5 <noreply@anthropic.com>
Claude-Session: https://claude.ai/code/session_01P8sJrjpHzGTZMreZNqqKfd
</commit_message>
<xml_diff>
--- a/docs/projektplan.docx
+++ b/docs/projektplan.docx
@@ -3902,6 +3902,92 @@
       </w:r>
       <w:r>
         <w:t xml:space="preserve">altında listeli.</w:t>
+      </w:r>
+    </w:p>
+    <w:p>
+      <w:pPr>
+        <w:pStyle w:val="BodyText"/>
+      </w:pPr>
+      <w:r>
+        <w:t xml:space="preserve">Drive klasöründeki 50 ders videosu (</w:t>
+      </w:r>
+      <w:r>
+        <w:rPr>
+          <w:rStyle w:val="VerbatimChar"/>
+        </w:rPr>
+        <w:t xml:space="preserve">content/videos.json</w:t>
+      </w:r>
+      <w:r>
+        <w:t xml:space="preserve"> </w:t>
+      </w:r>
+      <w:r>
+        <w:t xml:space="preserve">→</w:t>
+      </w:r>
+      <w:r>
+        <w:t xml:space="preserve"> </w:t>
+      </w:r>
+      <w:r>
+        <w:rPr>
+          <w:rStyle w:val="VerbatimChar"/>
+        </w:rPr>
+        <w:t xml:space="preserve">drive</w:t>
+      </w:r>
+      <w:r>
+        <w:t xml:space="preserve">) eksik üç üniteyi tamamlıyor: Lektion 2 (1 bis 9), Lektion 3 (Zehner und Einer) ve Lektion 30 (Big Friends −4). Drive oynatıcısı videonun bittiğini bildirmediği için</w:t>
+      </w:r>
+      <w:r>
+        <w:t xml:space="preserve"> </w:t>
+      </w:r>
+      <w:r>
+        <w:t xml:space="preserve">“</w:t>
+      </w:r>
+      <w:r>
+        <w:t xml:space="preserve">Weiter</w:t>
+      </w:r>
+      <w:r>
+        <w:t xml:space="preserve">”</w:t>
+      </w:r>
+      <w:r>
+        <w:t xml:space="preserve"> </w:t>
+      </w:r>
+      <w:r>
+        <w:t xml:space="preserve">sürenin %90’ından sonra açılır. Uzun vadede bu videoların da YouTube’a</w:t>
+      </w:r>
+      <w:r>
+        <w:t xml:space="preserve"> </w:t>
+      </w:r>
+      <w:r>
+        <w:t xml:space="preserve">“</w:t>
+      </w:r>
+      <w:r>
+        <w:t xml:space="preserve">nicht gelistet</w:t>
+      </w:r>
+      <w:r>
+        <w:t xml:space="preserve">”</w:t>
+      </w:r>
+      <w:r>
+        <w:t xml:space="preserve"> </w:t>
+      </w:r>
+      <w:r>
+        <w:t xml:space="preserve">yüklenmesi önerilir (bitiş kesin algılanır, Drive kotası sorun olmaz).</w:t>
+      </w:r>
+      <w:r>
+        <w:t xml:space="preserve"> </w:t>
+      </w:r>
+      <w:r>
+        <w:t xml:space="preserve">“</w:t>
+      </w:r>
+      <w:r>
+        <w:t xml:space="preserve">X.1</w:t>
+      </w:r>
+      <w:r>
+        <w:t xml:space="preserve">”</w:t>
+      </w:r>
+      <w:r>
+        <w:t xml:space="preserve"> </w:t>
+      </w:r>
+      <w:r>
+        <w:t xml:space="preserve">videolar (her kuralın ikinci, alıştırma videosu) henüz bağlı değil.</w:t>
       </w:r>
     </w:p>
     <w:bookmarkStart w:id="30" w:name="bir-ünitenin-akışı"/>

</xml_diff>

<commit_message>
Abakus mit den Originalgrafiken von abacus.mentalmath.at
- Rahmen (orange/blau, 2–8 Stangen; 1 Stange aus dem 2er-Rahmen
  geschnitten), Perlen, Punkte und Klickton aus dem Original
- Geometrie wie im Original: 135 px Stangenabstand, Himmelsperle 50 px,
  Erdperlen 44 px Weg; rote Markierungsperle und Punkt auf jeder
  dritten Stange
- Perlen überall in der App sind jetzt die Originalbilder
- Grafiken werden für den Offline-Betrieb vorgeladen

Co-Authored-By: Claude Opus 5.5 <noreply@anthropic.com>
Claude-Session: https://claude.ai/code/session_01P8sJrjpHzGTZMreZNqqKfd
</commit_message>
<xml_diff>
--- a/docs/projektplan.docx
+++ b/docs/projektplan.docx
@@ -7202,19 +7202,19 @@
               <w:jc w:val="left"/>
             </w:pPr>
             <w:r>
-              <w:t xml:space="preserve">Kendi SVG bileşenimiz (2–8 sütun)</w:t>
-            </w:r>
-          </w:p>
-        </w:tc>
-        <w:tc>
-          <w:tcPr/>
-          <w:p>
-            <w:pPr>
-              <w:pStyle w:val="Compact"/>
-              <w:jc w:val="left"/>
-            </w:pPr>
-            <w:r>
-              <w:t xml:space="preserve">Sayı gösterme, animasyon, cevap kontrolü; oyundaki abaküsün görünümü</w:t>
+              <w:t xml:space="preserve">Kendi bileşenimiz, abacus.mentalmath.at’in orijinal grafikleriyle (1–8 sütun)</w:t>
+            </w:r>
+          </w:p>
+        </w:tc>
+        <w:tc>
+          <w:tcPr/>
+          <w:p>
+            <w:pPr>
+              <w:pStyle w:val="Compact"/>
+              <w:jc w:val="left"/>
+            </w:pPr>
+            <w:r>
+              <w:t xml:space="preserve">Uygulama, web abaküsü ve yeni videolar birebir aynı görünür; sayı gösterme, cevap kontrolü</w:t>
             </w:r>
           </w:p>
         </w:tc>

</xml_diff>